<commit_message>
Added Experiment 6 code and output
</commit_message>
<xml_diff>
--- a/Exp6/Exp6_Code_Output.docx
+++ b/Exp6/Exp6_Code_Output.docx
@@ -311,13 +311,26 @@
         </w:rPr>
         <w:t xml:space="preserve"> = </w:t>
       </w:r>
-      <w:proofErr w:type="spellStart"/>
       <w:proofErr w:type="gramStart"/>
       <w:r>
         <w:rPr>
           <w:lang w:val="en-US"/>
         </w:rPr>
-        <w:t>mmap</w:t>
+        <w:t>mmap(</w:t>
+      </w:r>
+      <w:proofErr w:type="gramEnd"/>
+      <w:r>
+        <w:rPr>
+          <w:lang w:val="en-US"/>
+        </w:rPr>
+        <w:t xml:space="preserve">NULL, </w:t>
+      </w:r>
+      <w:proofErr w:type="spellStart"/>
+      <w:r>
+        <w:rPr>
+          <w:lang w:val="en-US"/>
+        </w:rPr>
+        <w:t>sizeof</w:t>
       </w:r>
       <w:proofErr w:type="spellEnd"/>
       <w:r>
@@ -326,19 +339,167 @@
         </w:rPr>
         <w:t>(</w:t>
       </w:r>
+      <w:proofErr w:type="spellStart"/>
+      <w:r>
+        <w:rPr>
+          <w:lang w:val="en-US"/>
+        </w:rPr>
+        <w:t>sem_t</w:t>
+      </w:r>
+      <w:proofErr w:type="spellEnd"/>
+      <w:r>
+        <w:rPr>
+          <w:lang w:val="en-US"/>
+        </w:rPr>
+        <w:t>),</w:t>
+      </w:r>
+    </w:p>
+    <w:p>
+      <w:pPr>
+        <w:rPr>
+          <w:lang w:val="en-US"/>
+        </w:rPr>
+      </w:pPr>
+      <w:r>
+        <w:rPr>
+          <w:lang w:val="en-US"/>
+        </w:rPr>
+        <w:t xml:space="preserve">               PROT_READ | PROT_WRITE,</w:t>
+      </w:r>
+    </w:p>
+    <w:p>
+      <w:pPr>
+        <w:rPr>
+          <w:lang w:val="en-US"/>
+        </w:rPr>
+      </w:pPr>
+      <w:r>
+        <w:rPr>
+          <w:lang w:val="en-US"/>
+        </w:rPr>
+        <w:t xml:space="preserve">               MAP_SHARED | MAP_ANONYMOUS,</w:t>
+      </w:r>
+    </w:p>
+    <w:p>
+      <w:pPr>
+        <w:rPr>
+          <w:lang w:val="en-US"/>
+        </w:rPr>
+      </w:pPr>
+      <w:r>
+        <w:rPr>
+          <w:lang w:val="en-US"/>
+        </w:rPr>
+        <w:t xml:space="preserve">               -1, 0);</w:t>
+      </w:r>
+    </w:p>
+    <w:p>
+      <w:pPr>
+        <w:rPr>
+          <w:lang w:val="en-US"/>
+        </w:rPr>
+      </w:pPr>
+    </w:p>
+    <w:p>
+      <w:pPr>
+        <w:rPr>
+          <w:lang w:val="en-US"/>
+        </w:rPr>
+      </w:pPr>
+      <w:r>
+        <w:rPr>
+          <w:lang w:val="en-US"/>
+        </w:rPr>
+        <w:t xml:space="preserve">    </w:t>
+      </w:r>
+      <w:proofErr w:type="spellStart"/>
+      <w:r>
+        <w:rPr>
+          <w:lang w:val="en-US"/>
+        </w:rPr>
+        <w:t>sem_</w:t>
+      </w:r>
+      <w:proofErr w:type="gramStart"/>
+      <w:r>
+        <w:rPr>
+          <w:lang w:val="en-US"/>
+        </w:rPr>
+        <w:t>init</w:t>
+      </w:r>
+      <w:proofErr w:type="spellEnd"/>
+      <w:r>
+        <w:rPr>
+          <w:lang w:val="en-US"/>
+        </w:rPr>
+        <w:t>(</w:t>
+      </w:r>
+      <w:proofErr w:type="spellStart"/>
       <w:proofErr w:type="gramEnd"/>
       <w:r>
         <w:rPr>
           <w:lang w:val="en-US"/>
         </w:rPr>
-        <w:t xml:space="preserve">NULL, </w:t>
-      </w:r>
-      <w:proofErr w:type="spellStart"/>
-      <w:r>
-        <w:rPr>
-          <w:lang w:val="en-US"/>
-        </w:rPr>
-        <w:t>sizeof</w:t>
+        <w:t>sem</w:t>
+      </w:r>
+      <w:proofErr w:type="spellEnd"/>
+      <w:r>
+        <w:rPr>
+          <w:lang w:val="en-US"/>
+        </w:rPr>
+        <w:t>, 1, 1);</w:t>
+      </w:r>
+    </w:p>
+    <w:p>
+      <w:pPr>
+        <w:rPr>
+          <w:lang w:val="en-US"/>
+        </w:rPr>
+      </w:pPr>
+    </w:p>
+    <w:p>
+      <w:pPr>
+        <w:rPr>
+          <w:lang w:val="en-US"/>
+        </w:rPr>
+      </w:pPr>
+      <w:r>
+        <w:rPr>
+          <w:lang w:val="en-US"/>
+        </w:rPr>
+        <w:t xml:space="preserve">    if(fork() == 0)</w:t>
+      </w:r>
+    </w:p>
+    <w:p>
+      <w:pPr>
+        <w:rPr>
+          <w:lang w:val="en-US"/>
+        </w:rPr>
+      </w:pPr>
+      <w:r>
+        <w:rPr>
+          <w:lang w:val="en-US"/>
+        </w:rPr>
+        <w:t xml:space="preserve">    {</w:t>
+      </w:r>
+    </w:p>
+    <w:p>
+      <w:pPr>
+        <w:rPr>
+          <w:lang w:val="en-US"/>
+        </w:rPr>
+      </w:pPr>
+      <w:r>
+        <w:rPr>
+          <w:lang w:val="en-US"/>
+        </w:rPr>
+        <w:t xml:space="preserve">        </w:t>
+      </w:r>
+      <w:proofErr w:type="spellStart"/>
+      <w:r>
+        <w:rPr>
+          <w:lang w:val="en-US"/>
+        </w:rPr>
+        <w:t>sem_wait</w:t>
       </w:r>
       <w:proofErr w:type="spellEnd"/>
       <w:r>
@@ -352,87 +513,101 @@
         <w:rPr>
           <w:lang w:val="en-US"/>
         </w:rPr>
-        <w:t>sem_t</w:t>
-      </w:r>
-      <w:proofErr w:type="spellEnd"/>
-      <w:r>
-        <w:rPr>
-          <w:lang w:val="en-US"/>
-        </w:rPr>
-        <w:t>),</w:t>
-      </w:r>
-    </w:p>
-    <w:p>
-      <w:pPr>
-        <w:rPr>
-          <w:lang w:val="en-US"/>
-        </w:rPr>
-      </w:pPr>
-      <w:r>
-        <w:rPr>
-          <w:lang w:val="en-US"/>
-        </w:rPr>
-        <w:t xml:space="preserve">               PROT_READ | PROT_WRITE,</w:t>
-      </w:r>
-    </w:p>
-    <w:p>
-      <w:pPr>
-        <w:rPr>
-          <w:lang w:val="en-US"/>
-        </w:rPr>
-      </w:pPr>
-      <w:r>
-        <w:rPr>
-          <w:lang w:val="en-US"/>
-        </w:rPr>
-        <w:t xml:space="preserve">               MAP_SHARED | MAP_ANONYMOUS,</w:t>
-      </w:r>
-    </w:p>
-    <w:p>
-      <w:pPr>
-        <w:rPr>
-          <w:lang w:val="en-US"/>
-        </w:rPr>
-      </w:pPr>
-      <w:r>
-        <w:rPr>
-          <w:lang w:val="en-US"/>
-        </w:rPr>
-        <w:t xml:space="preserve">               -1, 0);</w:t>
-      </w:r>
-    </w:p>
-    <w:p>
-      <w:pPr>
-        <w:rPr>
-          <w:lang w:val="en-US"/>
-        </w:rPr>
-      </w:pPr>
-    </w:p>
-    <w:p>
-      <w:pPr>
-        <w:rPr>
-          <w:lang w:val="en-US"/>
-        </w:rPr>
-      </w:pPr>
-      <w:r>
-        <w:rPr>
-          <w:lang w:val="en-US"/>
-        </w:rPr>
-        <w:t xml:space="preserve">    </w:t>
-      </w:r>
-      <w:proofErr w:type="spellStart"/>
-      <w:r>
-        <w:rPr>
-          <w:lang w:val="en-US"/>
-        </w:rPr>
-        <w:t>sem_</w:t>
-      </w:r>
-      <w:proofErr w:type="gramStart"/>
-      <w:r>
-        <w:rPr>
-          <w:lang w:val="en-US"/>
-        </w:rPr>
-        <w:t>init</w:t>
+        <w:t>sem</w:t>
+      </w:r>
+      <w:proofErr w:type="spellEnd"/>
+      <w:r>
+        <w:rPr>
+          <w:lang w:val="en-US"/>
+        </w:rPr>
+        <w:t>);</w:t>
+      </w:r>
+    </w:p>
+    <w:p>
+      <w:pPr>
+        <w:rPr>
+          <w:lang w:val="en-US"/>
+        </w:rPr>
+      </w:pPr>
+      <w:r>
+        <w:rPr>
+          <w:lang w:val="en-US"/>
+        </w:rPr>
+        <w:t xml:space="preserve">        </w:t>
+      </w:r>
+      <w:proofErr w:type="spellStart"/>
+      <w:r>
+        <w:rPr>
+          <w:lang w:val="en-US"/>
+        </w:rPr>
+        <w:t>printf</w:t>
+      </w:r>
+      <w:proofErr w:type="spellEnd"/>
+      <w:r>
+        <w:rPr>
+          <w:lang w:val="en-US"/>
+        </w:rPr>
+        <w:t>("Child Process Entering Critical Section\n");</w:t>
+      </w:r>
+    </w:p>
+    <w:p>
+      <w:pPr>
+        <w:rPr>
+          <w:lang w:val="en-US"/>
+        </w:rPr>
+      </w:pPr>
+      <w:r>
+        <w:rPr>
+          <w:lang w:val="en-US"/>
+        </w:rPr>
+        <w:t xml:space="preserve">        sleep(3);</w:t>
+      </w:r>
+    </w:p>
+    <w:p>
+      <w:pPr>
+        <w:rPr>
+          <w:lang w:val="en-US"/>
+        </w:rPr>
+      </w:pPr>
+      <w:r>
+        <w:rPr>
+          <w:lang w:val="en-US"/>
+        </w:rPr>
+        <w:t xml:space="preserve">        </w:t>
+      </w:r>
+      <w:proofErr w:type="spellStart"/>
+      <w:r>
+        <w:rPr>
+          <w:lang w:val="en-US"/>
+        </w:rPr>
+        <w:t>printf</w:t>
+      </w:r>
+      <w:proofErr w:type="spellEnd"/>
+      <w:r>
+        <w:rPr>
+          <w:lang w:val="en-US"/>
+        </w:rPr>
+        <w:t>("Child Process Leaving Critical Section\n");</w:t>
+      </w:r>
+    </w:p>
+    <w:p>
+      <w:pPr>
+        <w:rPr>
+          <w:lang w:val="en-US"/>
+        </w:rPr>
+      </w:pPr>
+      <w:r>
+        <w:rPr>
+          <w:lang w:val="en-US"/>
+        </w:rPr>
+        <w:t xml:space="preserve">        </w:t>
+      </w:r>
+      <w:proofErr w:type="spellStart"/>
+      <w:r>
+        <w:rPr>
+          <w:lang w:val="en-US"/>
+        </w:rPr>
+        <w:t>sem_post</w:t>
       </w:r>
       <w:proofErr w:type="spellEnd"/>
       <w:r>
@@ -442,7 +617,6 @@
         <w:t>(</w:t>
       </w:r>
       <w:proofErr w:type="spellStart"/>
-      <w:proofErr w:type="gramEnd"/>
       <w:r>
         <w:rPr>
           <w:lang w:val="en-US"/>
@@ -454,94 +628,6 @@
         <w:rPr>
           <w:lang w:val="en-US"/>
         </w:rPr>
-        <w:t>, 1, 1);</w:t>
-      </w:r>
-    </w:p>
-    <w:p>
-      <w:pPr>
-        <w:rPr>
-          <w:lang w:val="en-US"/>
-        </w:rPr>
-      </w:pPr>
-    </w:p>
-    <w:p>
-      <w:pPr>
-        <w:rPr>
-          <w:lang w:val="en-US"/>
-        </w:rPr>
-      </w:pPr>
-      <w:r>
-        <w:rPr>
-          <w:lang w:val="en-US"/>
-        </w:rPr>
-        <w:t xml:space="preserve">    if(</w:t>
-      </w:r>
-      <w:proofErr w:type="gramStart"/>
-      <w:r>
-        <w:rPr>
-          <w:lang w:val="en-US"/>
-        </w:rPr>
-        <w:t>fork(</w:t>
-      </w:r>
-      <w:proofErr w:type="gramEnd"/>
-      <w:r>
-        <w:rPr>
-          <w:lang w:val="en-US"/>
-        </w:rPr>
-        <w:t>) == 0)</w:t>
-      </w:r>
-    </w:p>
-    <w:p>
-      <w:pPr>
-        <w:rPr>
-          <w:lang w:val="en-US"/>
-        </w:rPr>
-      </w:pPr>
-      <w:r>
-        <w:rPr>
-          <w:lang w:val="en-US"/>
-        </w:rPr>
-        <w:t xml:space="preserve">    {</w:t>
-      </w:r>
-    </w:p>
-    <w:p>
-      <w:pPr>
-        <w:rPr>
-          <w:lang w:val="en-US"/>
-        </w:rPr>
-      </w:pPr>
-      <w:r>
-        <w:rPr>
-          <w:lang w:val="en-US"/>
-        </w:rPr>
-        <w:t xml:space="preserve">        </w:t>
-      </w:r>
-      <w:proofErr w:type="spellStart"/>
-      <w:r>
-        <w:rPr>
-          <w:lang w:val="en-US"/>
-        </w:rPr>
-        <w:t>sem_wait</w:t>
-      </w:r>
-      <w:proofErr w:type="spellEnd"/>
-      <w:r>
-        <w:rPr>
-          <w:lang w:val="en-US"/>
-        </w:rPr>
-        <w:t>(</w:t>
-      </w:r>
-      <w:proofErr w:type="spellStart"/>
-      <w:r>
-        <w:rPr>
-          <w:lang w:val="en-US"/>
-        </w:rPr>
-        <w:t>sem</w:t>
-      </w:r>
-      <w:proofErr w:type="spellEnd"/>
-      <w:r>
-        <w:rPr>
-          <w:lang w:val="en-US"/>
-        </w:rPr>
         <w:t>);</w:t>
       </w:r>
     </w:p>
@@ -555,159 +641,7 @@
         <w:rPr>
           <w:lang w:val="en-US"/>
         </w:rPr>
-        <w:t xml:space="preserve">        </w:t>
-      </w:r>
-      <w:proofErr w:type="spellStart"/>
-      <w:proofErr w:type="gramStart"/>
-      <w:r>
-        <w:rPr>
-          <w:lang w:val="en-US"/>
-        </w:rPr>
-        <w:t>printf</w:t>
-      </w:r>
-      <w:proofErr w:type="spellEnd"/>
-      <w:r>
-        <w:rPr>
-          <w:lang w:val="en-US"/>
-        </w:rPr>
-        <w:t>(</w:t>
-      </w:r>
-      <w:proofErr w:type="gramEnd"/>
-      <w:r>
-        <w:rPr>
-          <w:lang w:val="en-US"/>
-        </w:rPr>
-        <w:t>"Child Process Entering Critical Section\n");</w:t>
-      </w:r>
-    </w:p>
-    <w:p>
-      <w:pPr>
-        <w:rPr>
-          <w:lang w:val="en-US"/>
-        </w:rPr>
-      </w:pPr>
-      <w:r>
-        <w:rPr>
-          <w:lang w:val="en-US"/>
-        </w:rPr>
-        <w:t xml:space="preserve">        </w:t>
-      </w:r>
-      <w:proofErr w:type="gramStart"/>
-      <w:r>
-        <w:rPr>
-          <w:lang w:val="en-US"/>
-        </w:rPr>
-        <w:t>sleep(</w:t>
-      </w:r>
-      <w:proofErr w:type="gramEnd"/>
-      <w:r>
-        <w:rPr>
-          <w:lang w:val="en-US"/>
-        </w:rPr>
-        <w:t>3);</w:t>
-      </w:r>
-    </w:p>
-    <w:p>
-      <w:pPr>
-        <w:rPr>
-          <w:lang w:val="en-US"/>
-        </w:rPr>
-      </w:pPr>
-      <w:r>
-        <w:rPr>
-          <w:lang w:val="en-US"/>
-        </w:rPr>
-        <w:t xml:space="preserve">        </w:t>
-      </w:r>
-      <w:proofErr w:type="spellStart"/>
-      <w:proofErr w:type="gramStart"/>
-      <w:r>
-        <w:rPr>
-          <w:lang w:val="en-US"/>
-        </w:rPr>
-        <w:t>printf</w:t>
-      </w:r>
-      <w:proofErr w:type="spellEnd"/>
-      <w:r>
-        <w:rPr>
-          <w:lang w:val="en-US"/>
-        </w:rPr>
-        <w:t>(</w:t>
-      </w:r>
-      <w:proofErr w:type="gramEnd"/>
-      <w:r>
-        <w:rPr>
-          <w:lang w:val="en-US"/>
-        </w:rPr>
-        <w:t>"Child Process Leaving Critical Section\n");</w:t>
-      </w:r>
-    </w:p>
-    <w:p>
-      <w:pPr>
-        <w:rPr>
-          <w:lang w:val="en-US"/>
-        </w:rPr>
-      </w:pPr>
-      <w:r>
-        <w:rPr>
-          <w:lang w:val="en-US"/>
-        </w:rPr>
-        <w:t xml:space="preserve">        </w:t>
-      </w:r>
-      <w:proofErr w:type="spellStart"/>
-      <w:r>
-        <w:rPr>
-          <w:lang w:val="en-US"/>
-        </w:rPr>
-        <w:t>sem_post</w:t>
-      </w:r>
-      <w:proofErr w:type="spellEnd"/>
-      <w:r>
-        <w:rPr>
-          <w:lang w:val="en-US"/>
-        </w:rPr>
-        <w:t>(</w:t>
-      </w:r>
-      <w:proofErr w:type="spellStart"/>
-      <w:r>
-        <w:rPr>
-          <w:lang w:val="en-US"/>
-        </w:rPr>
-        <w:t>sem</w:t>
-      </w:r>
-      <w:proofErr w:type="spellEnd"/>
-      <w:r>
-        <w:rPr>
-          <w:lang w:val="en-US"/>
-        </w:rPr>
-        <w:t>);</w:t>
-      </w:r>
-    </w:p>
-    <w:p>
-      <w:pPr>
-        <w:rPr>
-          <w:lang w:val="en-US"/>
-        </w:rPr>
-      </w:pPr>
-      <w:r>
-        <w:rPr>
-          <w:lang w:val="en-US"/>
-        </w:rPr>
-        <w:t xml:space="preserve">        </w:t>
-      </w:r>
-      <w:proofErr w:type="gramStart"/>
-      <w:r>
-        <w:rPr>
-          <w:lang w:val="en-US"/>
-        </w:rPr>
-        <w:t>exit(</w:t>
-      </w:r>
-      <w:proofErr w:type="gramEnd"/>
-      <w:r>
-        <w:rPr>
-          <w:lang w:val="en-US"/>
-        </w:rPr>
-        <w:t>0);</w:t>
+        <w:t xml:space="preserve">        exit(0);</w:t>
       </w:r>
     </w:p>
     <w:p>
@@ -785,7 +719,6 @@
         <w:t xml:space="preserve">    </w:t>
       </w:r>
       <w:proofErr w:type="spellStart"/>
-      <w:proofErr w:type="gramStart"/>
       <w:r>
         <w:rPr>
           <w:lang w:val="en-US"/>
@@ -797,14 +730,108 @@
         <w:rPr>
           <w:lang w:val="en-US"/>
         </w:rPr>
+        <w:t>("Parent Process Entering Critical Section\n");</w:t>
+      </w:r>
+    </w:p>
+    <w:p>
+      <w:pPr>
+        <w:rPr>
+          <w:lang w:val="en-US"/>
+        </w:rPr>
+      </w:pPr>
+      <w:r>
+        <w:rPr>
+          <w:lang w:val="en-US"/>
+        </w:rPr>
+        <w:t xml:space="preserve">    sleep(3);</w:t>
+      </w:r>
+    </w:p>
+    <w:p>
+      <w:pPr>
+        <w:rPr>
+          <w:lang w:val="en-US"/>
+        </w:rPr>
+      </w:pPr>
+      <w:r>
+        <w:rPr>
+          <w:lang w:val="en-US"/>
+        </w:rPr>
+        <w:t xml:space="preserve">    </w:t>
+      </w:r>
+      <w:proofErr w:type="spellStart"/>
+      <w:r>
+        <w:rPr>
+          <w:lang w:val="en-US"/>
+        </w:rPr>
+        <w:t>printf</w:t>
+      </w:r>
+      <w:proofErr w:type="spellEnd"/>
+      <w:r>
+        <w:rPr>
+          <w:lang w:val="en-US"/>
+        </w:rPr>
+        <w:t>("Parent Process Leaving Critical Section\n");</w:t>
+      </w:r>
+    </w:p>
+    <w:p>
+      <w:pPr>
+        <w:rPr>
+          <w:lang w:val="en-US"/>
+        </w:rPr>
+      </w:pPr>
+      <w:r>
+        <w:rPr>
+          <w:lang w:val="en-US"/>
+        </w:rPr>
+        <w:t xml:space="preserve">    </w:t>
+      </w:r>
+      <w:proofErr w:type="spellStart"/>
+      <w:r>
+        <w:rPr>
+          <w:lang w:val="en-US"/>
+        </w:rPr>
+        <w:t>sem_post</w:t>
+      </w:r>
+      <w:proofErr w:type="spellEnd"/>
+      <w:r>
+        <w:rPr>
+          <w:lang w:val="en-US"/>
+        </w:rPr>
         <w:t>(</w:t>
       </w:r>
-      <w:proofErr w:type="gramEnd"/>
-      <w:r>
-        <w:rPr>
-          <w:lang w:val="en-US"/>
-        </w:rPr>
-        <w:t>"Parent Process Entering Critical Section\n");</w:t>
+      <w:proofErr w:type="spellStart"/>
+      <w:r>
+        <w:rPr>
+          <w:lang w:val="en-US"/>
+        </w:rPr>
+        <w:t>sem</w:t>
+      </w:r>
+      <w:proofErr w:type="spellEnd"/>
+      <w:r>
+        <w:rPr>
+          <w:lang w:val="en-US"/>
+        </w:rPr>
+        <w:t>);</w:t>
+      </w:r>
+    </w:p>
+    <w:p>
+      <w:pPr>
+        <w:rPr>
+          <w:lang w:val="en-US"/>
+        </w:rPr>
+      </w:pPr>
+    </w:p>
+    <w:p>
+      <w:pPr>
+        <w:rPr>
+          <w:lang w:val="en-US"/>
+        </w:rPr>
+      </w:pPr>
+      <w:r>
+        <w:rPr>
+          <w:lang w:val="en-US"/>
+        </w:rPr>
+        <w:t xml:space="preserve">    wait(NULL);</w:t>
       </w:r>
     </w:p>
     <w:p>
@@ -819,40 +846,12 @@
         </w:rPr>
         <w:t xml:space="preserve">    </w:t>
       </w:r>
-      <w:proofErr w:type="gramStart"/>
-      <w:r>
-        <w:rPr>
-          <w:lang w:val="en-US"/>
-        </w:rPr>
-        <w:t>sleep(</w:t>
-      </w:r>
-      <w:proofErr w:type="gramEnd"/>
-      <w:r>
-        <w:rPr>
-          <w:lang w:val="en-US"/>
-        </w:rPr>
-        <w:t>3);</w:t>
-      </w:r>
-    </w:p>
-    <w:p>
-      <w:pPr>
-        <w:rPr>
-          <w:lang w:val="en-US"/>
-        </w:rPr>
-      </w:pPr>
-      <w:r>
-        <w:rPr>
-          <w:lang w:val="en-US"/>
-        </w:rPr>
-        <w:t xml:space="preserve">    </w:t>
-      </w:r>
-      <w:proofErr w:type="spellStart"/>
-      <w:proofErr w:type="gramStart"/>
-      <w:r>
-        <w:rPr>
-          <w:lang w:val="en-US"/>
-        </w:rPr>
-        <w:t>printf</w:t>
+      <w:proofErr w:type="spellStart"/>
+      <w:r>
+        <w:rPr>
+          <w:lang w:val="en-US"/>
+        </w:rPr>
+        <w:t>sem_destroy</w:t>
       </w:r>
       <w:proofErr w:type="spellEnd"/>
       <w:r>
@@ -861,40 +860,6 @@
         </w:rPr>
         <w:t>(</w:t>
       </w:r>
-      <w:proofErr w:type="gramEnd"/>
-      <w:r>
-        <w:rPr>
-          <w:lang w:val="en-US"/>
-        </w:rPr>
-        <w:t>"Parent Process Leaving Critical Section\n");</w:t>
-      </w:r>
-    </w:p>
-    <w:p>
-      <w:pPr>
-        <w:rPr>
-          <w:lang w:val="en-US"/>
-        </w:rPr>
-      </w:pPr>
-      <w:r>
-        <w:rPr>
-          <w:lang w:val="en-US"/>
-        </w:rPr>
-        <w:t xml:space="preserve">    </w:t>
-      </w:r>
-      <w:proofErr w:type="spellStart"/>
-      <w:r>
-        <w:rPr>
-          <w:lang w:val="en-US"/>
-        </w:rPr>
-        <w:t>sem_post</w:t>
-      </w:r>
-      <w:proofErr w:type="spellEnd"/>
-      <w:r>
-        <w:rPr>
-          <w:lang w:val="en-US"/>
-        </w:rPr>
-        <w:t>(</w:t>
-      </w:r>
       <w:proofErr w:type="spellStart"/>
       <w:r>
         <w:rPr>
@@ -927,81 +892,6 @@
         <w:rPr>
           <w:lang w:val="en-US"/>
         </w:rPr>
-        <w:t xml:space="preserve">    </w:t>
-      </w:r>
-      <w:proofErr w:type="gramStart"/>
-      <w:r>
-        <w:rPr>
-          <w:lang w:val="en-US"/>
-        </w:rPr>
-        <w:t>wait(</w:t>
-      </w:r>
-      <w:proofErr w:type="gramEnd"/>
-      <w:r>
-        <w:rPr>
-          <w:lang w:val="en-US"/>
-        </w:rPr>
-        <w:t>NULL);</w:t>
-      </w:r>
-    </w:p>
-    <w:p>
-      <w:pPr>
-        <w:rPr>
-          <w:lang w:val="en-US"/>
-        </w:rPr>
-      </w:pPr>
-      <w:r>
-        <w:rPr>
-          <w:lang w:val="en-US"/>
-        </w:rPr>
-        <w:t xml:space="preserve">    </w:t>
-      </w:r>
-      <w:proofErr w:type="spellStart"/>
-      <w:r>
-        <w:rPr>
-          <w:lang w:val="en-US"/>
-        </w:rPr>
-        <w:t>sem_destroy</w:t>
-      </w:r>
-      <w:proofErr w:type="spellEnd"/>
-      <w:r>
-        <w:rPr>
-          <w:lang w:val="en-US"/>
-        </w:rPr>
-        <w:t>(</w:t>
-      </w:r>
-      <w:proofErr w:type="spellStart"/>
-      <w:r>
-        <w:rPr>
-          <w:lang w:val="en-US"/>
-        </w:rPr>
-        <w:t>sem</w:t>
-      </w:r>
-      <w:proofErr w:type="spellEnd"/>
-      <w:r>
-        <w:rPr>
-          <w:lang w:val="en-US"/>
-        </w:rPr>
-        <w:t>);</w:t>
-      </w:r>
-    </w:p>
-    <w:p>
-      <w:pPr>
-        <w:rPr>
-          <w:lang w:val="en-US"/>
-        </w:rPr>
-      </w:pPr>
-    </w:p>
-    <w:p>
-      <w:pPr>
-        <w:rPr>
-          <w:lang w:val="en-US"/>
-        </w:rPr>
-      </w:pPr>
-      <w:r>
-        <w:rPr>
-          <w:lang w:val="en-US"/>
-        </w:rPr>
         <w:t xml:space="preserve">    return 0;</w:t>
       </w:r>
     </w:p>
@@ -1038,19 +928,11 @@
           <w:lang w:val="en-US"/>
         </w:rPr>
       </w:pPr>
-      <w:proofErr w:type="gramStart"/>
-      <w:r>
-        <w:rPr>
-          <w:lang w:val="en-US"/>
-        </w:rPr>
-        <w:t>#!/</w:t>
-      </w:r>
-      <w:proofErr w:type="gramEnd"/>
-      <w:r>
-        <w:rPr>
-          <w:lang w:val="en-US"/>
-        </w:rPr>
-        <w:t>bin/bash</w:t>
+      <w:r>
+        <w:rPr>
+          <w:lang w:val="en-US"/>
+        </w:rPr>
+        <w:t>#!/bin/bash</w:t>
       </w:r>
     </w:p>
     <w:p>
@@ -1111,16 +993,8 @@
         <w:rPr>
           <w:lang w:val="en-US"/>
         </w:rPr>
-        <w:t>while [ -f "$LOCKFILE</w:t>
-      </w:r>
-      <w:proofErr w:type="gramStart"/>
-      <w:r>
-        <w:rPr>
-          <w:lang w:val="en-US"/>
-        </w:rPr>
-        <w:t>" ]</w:t>
-      </w:r>
-      <w:proofErr w:type="gramEnd"/>
+        <w:t>while [ -f "$LOCKFILE" ]</w:t>
+      </w:r>
     </w:p>
     <w:p>
       <w:pPr>
@@ -1269,6 +1143,7 @@
       </w:pPr>
       <w:r>
         <w:rPr>
+          <w:noProof/>
           <w:lang w:val="en-US"/>
         </w:rPr>
         <w:drawing>
@@ -1296,6 +1171,53 @@
                     <a:xfrm>
                       <a:off x="0" y="0"/>
                       <a:ext cx="3467400" cy="2209992"/>
+                    </a:xfrm>
+                    <a:prstGeom prst="rect">
+                      <a:avLst/>
+                    </a:prstGeom>
+                  </pic:spPr>
+                </pic:pic>
+              </a:graphicData>
+            </a:graphic>
+          </wp:inline>
+        </w:drawing>
+      </w:r>
+    </w:p>
+    <w:p>
+      <w:pPr>
+        <w:rPr>
+          <w:lang w:val="en-US"/>
+        </w:rPr>
+      </w:pPr>
+      <w:r>
+        <w:rPr>
+          <w:lang w:val="en-US"/>
+        </w:rPr>
+        <w:drawing>
+          <wp:inline distT="0" distB="0" distL="0" distR="0" wp14:anchorId="22D22D43" wp14:editId="741F1D42">
+            <wp:extent cx="4206605" cy="1486029"/>
+            <wp:effectExtent l="0" t="0" r="3810" b="0"/>
+            <wp:docPr id="56980862" name="Picture 1"/>
+            <wp:cNvGraphicFramePr>
+              <a:graphicFrameLocks xmlns:a="http://schemas.openxmlformats.org/drawingml/2006/main" noChangeAspect="1"/>
+            </wp:cNvGraphicFramePr>
+            <a:graphic xmlns:a="http://schemas.openxmlformats.org/drawingml/2006/main">
+              <a:graphicData uri="http://schemas.openxmlformats.org/drawingml/2006/picture">
+                <pic:pic xmlns:pic="http://schemas.openxmlformats.org/drawingml/2006/picture">
+                  <pic:nvPicPr>
+                    <pic:cNvPr id="56980862" name=""/>
+                    <pic:cNvPicPr/>
+                  </pic:nvPicPr>
+                  <pic:blipFill>
+                    <a:blip r:embed="rId5"/>
+                    <a:stretch>
+                      <a:fillRect/>
+                    </a:stretch>
+                  </pic:blipFill>
+                  <pic:spPr>
+                    <a:xfrm>
+                      <a:off x="0" y="0"/>
+                      <a:ext cx="4206605" cy="1486029"/>
                     </a:xfrm>
                     <a:prstGeom prst="rect">
                       <a:avLst/>
@@ -1921,6 +1843,7 @@
   <w:style w:type="character" w:default="1" w:styleId="DefaultParagraphFont">
     <w:name w:val="Default Paragraph Font"/>
     <w:uiPriority w:val="1"/>
+    <w:semiHidden/>
     <w:unhideWhenUsed/>
   </w:style>
   <w:style w:type="table" w:default="1" w:styleId="TableNormal">

</xml_diff>